<commit_message>
Incluye en el estado del arte las fotos añadidas por el autor
Se reinsertan las 9 fotos del documento enviado por el autor (Raven,
Molniya-2R, SYPAQ Corvo, Shahed, Minotaur, Auterion y sensores MQ)
en sus mismas posiciones, manteniendo los términos de defensa y
seguridad.

Co-Authored-By: Claude Opus 5.5 <noreply@anthropic.com>
Claude-Session: https://claude.ai/code/session_01WDj9q66eBCM3JAYdeZMuYf
</commit_message>
<xml_diff>
--- a/Resources/Software/Estado_del_arte_UAV_4G_LTE.docx
+++ b/Resources/Software/Estado_del_arte_UAV_4G_LTE.docx
@@ -962,98 +962,13 @@
     </w:p>
     <w:p>
       <w:pPr>
-        <w:pStyle w:val="Heading1"/>
-        <w:pBdr>
-          <w:bottom w:val="single" w:color="1F4E79" w:sz="6" w:space="4"/>
-        </w:pBdr>
-        <w:spacing w:after="160" w:before="360"/>
-      </w:pPr>
-      <w:r>
-        <w:rPr>
-          <w:rFonts w:ascii="Calibri" w:cs="Calibri" w:eastAsia="Calibri" w:hAnsi="Calibri"/>
-          <w:b/>
-          <w:bCs/>
-          <w:color w:val="1F4E79"/>
-          <w:sz w:val="30"/>
-          <w:szCs w:val="30"/>
-        </w:rPr>
-        <w:t xml:space="preserve">3. Molniya (Rusia) y su réplica ucraniana</w:t>
-      </w:r>
-    </w:p>
-    <w:p>
-      <w:pPr>
-        <w:spacing w:after="120" w:line="276"/>
-        <w:jc w:val="both"/>
-      </w:pPr>
-      <w:r>
-        <w:rPr>
-          <w:rFonts w:ascii="Calibri" w:cs="Calibri" w:eastAsia="Calibri" w:hAnsi="Calibri"/>
-          <w:sz w:val="22"/>
-          <w:szCs w:val="22"/>
-        </w:rPr>
-        <w:t xml:space="preserve">El </w:t>
-      </w:r>
-      <w:r>
-        <w:rPr>
-          <w:rFonts w:ascii="Calibri" w:cs="Calibri" w:eastAsia="Calibri" w:hAnsi="Calibri"/>
-          <w:b/>
-          <w:bCs/>
-          <w:sz w:val="22"/>
-          <w:szCs w:val="22"/>
-        </w:rPr>
-        <w:t xml:space="preserve">Molniya</w:t>
-      </w:r>
-      <w:r>
-        <w:rPr>
-          <w:rFonts w:ascii="Calibri" w:cs="Calibri" w:eastAsia="Calibri" w:hAnsi="Calibri"/>
-          <w:sz w:val="22"/>
-          <w:szCs w:val="22"/>
-        </w:rPr>
-        <w:t xml:space="preserve"> es un avión FPV de ala fija ruso, ligero, fácil de armar y de bajo costo. Se lanza con catapulta neumática, no se recupera, vuela hasta unos 40 minutos a una velocidad máxima de unos 80 km/h y tiene unos 30 km de alcance. Su estructura son dos tubos de aluminio longitudinales con sección central y alas de contrachapado, y se desarma en diez piezas que tres personas llevan en mochilas [1]. Un análisis austríaco describe que el diseño necesita unas 15 piezas distintas y de dos a cuatro horas-hombre de armado, con costillas de contrachapado cortado con láser forradas en lámina y sin fuselaje, y estima su costo de materiales por debajo de 400 euros. Lleva tres servos (dos alerones y timón) y una cámara frontal que transmite vídeo al piloto [2].</w:t>
-      </w:r>
-    </w:p>
-    <w:p>
-      <w:pPr>
-        <w:spacing w:after="120" w:line="276"/>
-        <w:jc w:val="both"/>
-      </w:pPr>
-      <w:r>
-        <w:rPr>
-          <w:rFonts w:ascii="Calibri" w:cs="Calibri" w:eastAsia="Calibri" w:hAnsi="Calibri"/>
-          <w:sz w:val="22"/>
-          <w:szCs w:val="22"/>
-        </w:rPr>
-        <w:t xml:space="preserve">Ucrania copia el diseño a partir de ejemplares capturados. La versión ucraniana descrita en prensa tiene </w:t>
-      </w:r>
-      <w:r>
-        <w:rPr>
-          <w:rFonts w:ascii="Calibri" w:cs="Calibri" w:eastAsia="Calibri" w:hAnsi="Calibri"/>
-          <w:b/>
-          <w:bCs/>
-          <w:sz w:val="22"/>
-          <w:szCs w:val="22"/>
-        </w:rPr>
-        <w:t xml:space="preserve">1,5 m de envergadura</w:t>
-      </w:r>
-      <w:r>
-        <w:rPr>
-          <w:rFonts w:ascii="Calibri" w:cs="Calibri" w:eastAsia="Calibri" w:hAnsi="Calibri"/>
-          <w:sz w:val="22"/>
-          <w:szCs w:val="22"/>
-        </w:rPr>
-        <w:t xml:space="preserve">, la misma que el UAV propuesto, aunque pesa unos 10 kg [1]. Es la confirmación más clara de que un avión de 1,5 m construido con materiales de aeromodelismo y electrónica comercial es una plataforma operativa robusta. La estructura de Depron con botalones de contrachapado del UAV propuesto pertenece a la misma categoría constructiva.</w:t>
-      </w:r>
-    </w:p>
-    <w:p>
-      <w:pPr>
-        <w:keepNext/>
-        <w:spacing w:after="40" w:before="120"/>
+        <w:spacing w:after="160" w:before="120"/>
         <w:jc w:val="center"/>
       </w:pPr>
       <w:r>
         <w:drawing>
           <wp:inline distT="0" distB="0" distL="0" distR="0">
-            <wp:extent cx="5905500" cy="2390775"/>
+            <wp:extent cx="3143250" cy="1314450"/>
             <wp:effectExtent t="0" r="0" b="0" l="0"/>
             <wp:docPr id="1" name="" descr="" title=""/>
             <wp:cNvGraphicFramePr>
@@ -1078,7 +993,7 @@
                   <pic:spPr bwMode="auto">
                     <a:xfrm>
                       <a:off x="0" y="0"/>
-                      <a:ext cx="5905500" cy="2390775"/>
+                      <a:ext cx="3143250" cy="1314450"/>
                     </a:xfrm>
                     <a:prstGeom prst="rect">
                       <a:avLst/>
@@ -1093,22 +1008,6 @@
     </w:p>
     <w:p>
       <w:pPr>
-        <w:spacing w:after="200" w:before="60"/>
-      </w:pPr>
-      <w:r>
-        <w:rPr>
-          <w:rFonts w:ascii="Calibri" w:cs="Calibri" w:eastAsia="Calibri" w:hAnsi="Calibri"/>
-          <w:i/>
-          <w:iCs/>
-          <w:color w:val="555555"/>
-          <w:sz w:val="18"/>
-          <w:szCs w:val="18"/>
-        </w:rPr>
-        <w:t xml:space="preserve">Figura 2. Comparación de tamaño en planta a la misma escala. Siluetas esquemáticas de elaboración propia, no son planos de las aeronaves; envergaduras según [1, 3, 4, 5] y los planos del proyecto. Las del Raven (≈1,4 m) y el Shahed-136 (≈2,5 m) son valores aproximados de referencia.</w:t>
-      </w:r>
-    </w:p>
-    <w:p>
-      <w:pPr>
         <w:pStyle w:val="Heading1"/>
         <w:pBdr>
           <w:bottom w:val="single" w:color="1F4E79" w:sz="6" w:space="4"/>
@@ -1124,7 +1023,7 @@
           <w:sz w:val="30"/>
           <w:szCs w:val="30"/>
         </w:rPr>
-        <w:t xml:space="preserve">4. Molniya-2R: Raspberry Pi 5, minicomputadora y Starlink</w:t>
+        <w:t xml:space="preserve">3. Molniya (Rusia) y su réplica ucraniana</w:t>
       </w:r>
     </w:p>
     <w:p>
@@ -1138,7 +1037,7 @@
           <w:sz w:val="22"/>
           <w:szCs w:val="22"/>
         </w:rPr>
-        <w:t xml:space="preserve">La variante de reconocimiento </w:t>
+        <w:t xml:space="preserve">El </w:t>
       </w:r>
       <w:r>
         <w:rPr>
@@ -1148,15 +1047,15 @@
           <w:sz w:val="22"/>
           <w:szCs w:val="22"/>
         </w:rPr>
-        <w:t xml:space="preserve">Molniya-2R</w:t>
-      </w:r>
-      <w:r>
-        <w:rPr>
-          <w:rFonts w:ascii="Calibri" w:cs="Calibri" w:eastAsia="Calibri" w:hAnsi="Calibri"/>
-          <w:sz w:val="22"/>
-          <w:szCs w:val="22"/>
-        </w:rPr>
-        <w:t xml:space="preserve">, identificada por la inteligencia ucraniana a fines de 2025, es arquitectónicamente casi idéntica a lo que propone el UAV propuesto. Lleva una Raspberry Pi 5 y una minicomputadora china (Mini PC F8) con Windows 11, una cámara con zoom óptico 10× estabilizada en tres ejes además de la cámara FPV, y un terminal Starlink que transporta el vídeo de ambas cámaras, la telemetría y los comandos [6]. El catálogo oficial ucraniano de componentes identifica el terminal como Starlink UTA-231 [7].</w:t>
+        <w:t xml:space="preserve">Molniya</w:t>
+      </w:r>
+      <w:r>
+        <w:rPr>
+          <w:rFonts w:ascii="Calibri" w:cs="Calibri" w:eastAsia="Calibri" w:hAnsi="Calibri"/>
+          <w:sz w:val="22"/>
+          <w:szCs w:val="22"/>
+        </w:rPr>
+        <w:t xml:space="preserve"> es un avión FPV de ala fija ruso, ligero, fácil de armar y de bajo costo. Se lanza con catapulta neumática, no se recupera, vuela hasta unos 40 minutos a una velocidad máxima de unos 80 km/h y tiene unos 30 km de alcance. Su estructura son dos tubos de aluminio longitudinales con sección central y alas de contrachapado, y se desarma en diez piezas que tres personas llevan en mochilas [1]. Un análisis austríaco describe que el diseño necesita unas 15 piezas distintas y de dos a cuatro horas-hombre de armado, con costillas de contrachapado cortado con láser forradas en lámina y sin fuselaje, y estima su costo de materiales por debajo de 400 euros. Lleva tres servos (dos alerones y timón) y una cámara frontal que transmite vídeo al piloto [2].</w:t>
       </w:r>
     </w:p>
     <w:p>
@@ -1170,7 +1069,25 @@
           <w:sz w:val="22"/>
           <w:szCs w:val="22"/>
         </w:rPr>
-        <w:t xml:space="preserve">Según el especialista en radio Serhii "Flash" Beskrestnov, los terminales Starlink empezaron a aparecer en gran número en estos aviones en diciembre de 2025: primero un Starlink Mini pegado con cinta y después integrado de fábrica en el fuselaje [8]. Comparado con el UAV propuesto, el Molniya-2R muestra la misma división de tareas (una computadora pequeña tipo Raspberry y otra para la misión) y el mismo principio de usar internet comercial como enlace. La diferencia es de escala: siendo un avión del orden de 10 kg (masa de su réplica ucraniana), puede cargar un terminal satelital de casi 1 kg que el UAV propuesto no puede.</w:t>
+        <w:t xml:space="preserve">Ucrania copia el diseño a partir de ejemplares capturados. La versión ucraniana descrita en prensa tiene </w:t>
+      </w:r>
+      <w:r>
+        <w:rPr>
+          <w:rFonts w:ascii="Calibri" w:cs="Calibri" w:eastAsia="Calibri" w:hAnsi="Calibri"/>
+          <w:b/>
+          <w:bCs/>
+          <w:sz w:val="22"/>
+          <w:szCs w:val="22"/>
+        </w:rPr>
+        <w:t xml:space="preserve">1,5 m de envergadura</w:t>
+      </w:r>
+      <w:r>
+        <w:rPr>
+          <w:rFonts w:ascii="Calibri" w:cs="Calibri" w:eastAsia="Calibri" w:hAnsi="Calibri"/>
+          <w:sz w:val="22"/>
+          <w:szCs w:val="22"/>
+        </w:rPr>
+        <w:t xml:space="preserve">, la misma que el UAV propuesto, aunque pesa unos 10 kg [1]. Es la confirmación más clara de que un avión de 1,5 m construido con materiales de aeromodelismo y electrónica comercial es una plataforma operativa robusta. La estructura de Depron con botalones de contrachapado del UAV propuesto pertenece a la misma categoría constructiva.</w:t>
       </w:r>
     </w:p>
     <w:p>
@@ -1182,7 +1099,7 @@
       <w:r>
         <w:drawing>
           <wp:inline distT="0" distB="0" distL="0" distR="0">
-            <wp:extent cx="5905500" cy="3667125"/>
+            <wp:extent cx="5905500" cy="2390775"/>
             <wp:effectExtent t="0" r="0" b="0" l="0"/>
             <wp:docPr id="1" name="" descr="" title=""/>
             <wp:cNvGraphicFramePr>
@@ -1207,6 +1124,227 @@
                   <pic:spPr bwMode="auto">
                     <a:xfrm>
                       <a:off x="0" y="0"/>
+                      <a:ext cx="5905500" cy="2390775"/>
+                    </a:xfrm>
+                    <a:prstGeom prst="rect">
+                      <a:avLst/>
+                    </a:prstGeom>
+                  </pic:spPr>
+                </pic:pic>
+              </a:graphicData>
+            </a:graphic>
+          </wp:inline>
+        </w:drawing>
+      </w:r>
+    </w:p>
+    <w:p>
+      <w:pPr>
+        <w:spacing w:after="200" w:before="60"/>
+      </w:pPr>
+      <w:r>
+        <w:rPr>
+          <w:rFonts w:ascii="Calibri" w:cs="Calibri" w:eastAsia="Calibri" w:hAnsi="Calibri"/>
+          <w:i/>
+          <w:iCs/>
+          <w:color w:val="555555"/>
+          <w:sz w:val="18"/>
+          <w:szCs w:val="18"/>
+        </w:rPr>
+        <w:t xml:space="preserve">Figura 2. Comparación de tamaño en planta a la misma escala. Siluetas esquemáticas de elaboración propia, no son planos de las aeronaves; envergaduras según [1, 3, 4, 5] y los planos del proyecto. Las del Raven (≈1,4 m) y el Shahed-136 (≈2,5 m) son valores aproximados de referencia.</w:t>
+      </w:r>
+    </w:p>
+    <w:p>
+      <w:pPr>
+        <w:pStyle w:val="Heading1"/>
+        <w:pBdr>
+          <w:bottom w:val="single" w:color="1F4E79" w:sz="6" w:space="4"/>
+        </w:pBdr>
+        <w:spacing w:after="160" w:before="360"/>
+      </w:pPr>
+      <w:r>
+        <w:rPr>
+          <w:rFonts w:ascii="Calibri" w:cs="Calibri" w:eastAsia="Calibri" w:hAnsi="Calibri"/>
+          <w:b/>
+          <w:bCs/>
+          <w:color w:val="1F4E79"/>
+          <w:sz w:val="30"/>
+          <w:szCs w:val="30"/>
+        </w:rPr>
+        <w:t xml:space="preserve">4. Molniya-2R: Raspberry Pi 5, minicomputadora y Starlink</w:t>
+      </w:r>
+    </w:p>
+    <w:p>
+      <w:pPr>
+        <w:spacing w:after="120" w:line="276"/>
+        <w:jc w:val="both"/>
+      </w:pPr>
+      <w:r>
+        <w:rPr>
+          <w:rFonts w:ascii="Calibri" w:cs="Calibri" w:eastAsia="Calibri" w:hAnsi="Calibri"/>
+          <w:sz w:val="22"/>
+          <w:szCs w:val="22"/>
+        </w:rPr>
+        <w:t xml:space="preserve">La variante de reconocimiento </w:t>
+      </w:r>
+      <w:r>
+        <w:rPr>
+          <w:rFonts w:ascii="Calibri" w:cs="Calibri" w:eastAsia="Calibri" w:hAnsi="Calibri"/>
+          <w:b/>
+          <w:bCs/>
+          <w:sz w:val="22"/>
+          <w:szCs w:val="22"/>
+        </w:rPr>
+        <w:t xml:space="preserve">Molniya-2R</w:t>
+      </w:r>
+      <w:r>
+        <w:rPr>
+          <w:rFonts w:ascii="Calibri" w:cs="Calibri" w:eastAsia="Calibri" w:hAnsi="Calibri"/>
+          <w:sz w:val="22"/>
+          <w:szCs w:val="22"/>
+        </w:rPr>
+        <w:t xml:space="preserve">, identificada por la inteligencia ucraniana a fines de 2025, es arquitectónicamente casi idéntica a lo que propone el UAV propuesto. Lleva una Raspberry Pi 5 y una minicomputadora china (Mini PC F8) con Windows 11, una cámara con zoom óptico 10× estabilizada en tres ejes además de la cámara FPV, y un terminal Starlink que transporta el vídeo de ambas cámaras, la telemetría y los comandos [6]. El catálogo oficial ucraniano de componentes identifica el terminal como Starlink UTA-231 [7].</w:t>
+      </w:r>
+    </w:p>
+    <w:p>
+      <w:pPr>
+        <w:spacing w:after="120" w:line="276"/>
+        <w:jc w:val="both"/>
+      </w:pPr>
+      <w:r>
+        <w:rPr>
+          <w:rFonts w:ascii="Calibri" w:cs="Calibri" w:eastAsia="Calibri" w:hAnsi="Calibri"/>
+          <w:sz w:val="22"/>
+          <w:szCs w:val="22"/>
+        </w:rPr>
+        <w:t xml:space="preserve">Según el especialista en radio Serhii "Flash" Beskrestnov, los terminales Starlink empezaron a aparecer en gran número en estos aviones en diciembre de 2025: primero un Starlink Mini pegado con cinta y después integrado de fábrica en el fuselaje [8]. Comparado con el UAV propuesto, el Molniya-2R muestra la misma división de tareas (una computadora pequeña tipo Raspberry y otra para la misión) y el mismo principio de usar internet comercial como enlace. La diferencia es de escala: siendo un avión del orden de 10 kg (masa de su réplica ucraniana), puede cargar un terminal satelital de casi 1 kg que el UAV propuesto no puede.</w:t>
+      </w:r>
+    </w:p>
+    <w:p>
+      <w:pPr>
+        <w:spacing w:after="160" w:before="120"/>
+        <w:jc w:val="center"/>
+      </w:pPr>
+      <w:r>
+        <w:drawing>
+          <wp:inline distT="0" distB="0" distL="0" distR="0">
+            <wp:extent cx="5334000" cy="2990850"/>
+            <wp:effectExtent t="0" r="0" b="0" l="0"/>
+            <wp:docPr id="1" name="" descr="" title=""/>
+            <wp:cNvGraphicFramePr>
+              <a:graphicFrameLocks xmlns:a="http://schemas.openxmlformats.org/drawingml/2006/main" noChangeAspect="1"/>
+            </wp:cNvGraphicFramePr>
+            <a:graphic xmlns:a="http://schemas.openxmlformats.org/drawingml/2006/main">
+              <a:graphicData uri="http://schemas.openxmlformats.org/drawingml/2006/picture">
+                <pic:pic xmlns:pic="http://schemas.openxmlformats.org/drawingml/2006/picture">
+                  <pic:nvPicPr>
+                    <pic:cNvPr id="0" name="" descr=""/>
+                    <pic:cNvPicPr>
+                      <a:picLocks noChangeAspect="1" noChangeArrowheads="1"/>
+                    </pic:cNvPicPr>
+                  </pic:nvPicPr>
+                  <pic:blipFill>
+                    <a:blip r:embed="rId12" cstate="none"/>
+                    <a:srcRect/>
+                    <a:stretch>
+                      <a:fillRect/>
+                    </a:stretch>
+                  </pic:blipFill>
+                  <pic:spPr bwMode="auto">
+                    <a:xfrm>
+                      <a:off x="0" y="0"/>
+                      <a:ext cx="5334000" cy="2990850"/>
+                    </a:xfrm>
+                    <a:prstGeom prst="rect">
+                      <a:avLst/>
+                    </a:prstGeom>
+                  </pic:spPr>
+                </pic:pic>
+              </a:graphicData>
+            </a:graphic>
+          </wp:inline>
+        </w:drawing>
+      </w:r>
+    </w:p>
+    <w:p>
+      <w:pPr>
+        <w:spacing w:after="160" w:before="120"/>
+        <w:jc w:val="center"/>
+      </w:pPr>
+      <w:r>
+        <w:drawing>
+          <wp:inline distT="0" distB="0" distL="0" distR="0">
+            <wp:extent cx="4286250" cy="2428875"/>
+            <wp:effectExtent t="0" r="0" b="0" l="0"/>
+            <wp:docPr id="1" name="" descr="" title=""/>
+            <wp:cNvGraphicFramePr>
+              <a:graphicFrameLocks xmlns:a="http://schemas.openxmlformats.org/drawingml/2006/main" noChangeAspect="1"/>
+            </wp:cNvGraphicFramePr>
+            <a:graphic xmlns:a="http://schemas.openxmlformats.org/drawingml/2006/main">
+              <a:graphicData uri="http://schemas.openxmlformats.org/drawingml/2006/picture">
+                <pic:pic xmlns:pic="http://schemas.openxmlformats.org/drawingml/2006/picture">
+                  <pic:nvPicPr>
+                    <pic:cNvPr id="0" name="" descr=""/>
+                    <pic:cNvPicPr>
+                      <a:picLocks noChangeAspect="1" noChangeArrowheads="1"/>
+                    </pic:cNvPicPr>
+                  </pic:nvPicPr>
+                  <pic:blipFill>
+                    <a:blip r:embed="rId13" cstate="none"/>
+                    <a:srcRect/>
+                    <a:stretch>
+                      <a:fillRect/>
+                    </a:stretch>
+                  </pic:blipFill>
+                  <pic:spPr bwMode="auto">
+                    <a:xfrm>
+                      <a:off x="0" y="0"/>
+                      <a:ext cx="4286250" cy="2428875"/>
+                    </a:xfrm>
+                    <a:prstGeom prst="rect">
+                      <a:avLst/>
+                    </a:prstGeom>
+                  </pic:spPr>
+                </pic:pic>
+              </a:graphicData>
+            </a:graphic>
+          </wp:inline>
+        </w:drawing>
+      </w:r>
+    </w:p>
+    <w:p>
+      <w:pPr>
+        <w:keepNext/>
+        <w:spacing w:after="40" w:before="120"/>
+        <w:jc w:val="center"/>
+      </w:pPr>
+      <w:r>
+        <w:drawing>
+          <wp:inline distT="0" distB="0" distL="0" distR="0">
+            <wp:extent cx="5905500" cy="3667125"/>
+            <wp:effectExtent t="0" r="0" b="0" l="0"/>
+            <wp:docPr id="1" name="" descr="" title=""/>
+            <wp:cNvGraphicFramePr>
+              <a:graphicFrameLocks xmlns:a="http://schemas.openxmlformats.org/drawingml/2006/main" noChangeAspect="1"/>
+            </wp:cNvGraphicFramePr>
+            <a:graphic xmlns:a="http://schemas.openxmlformats.org/drawingml/2006/main">
+              <a:graphicData uri="http://schemas.openxmlformats.org/drawingml/2006/picture">
+                <pic:pic xmlns:pic="http://schemas.openxmlformats.org/drawingml/2006/picture">
+                  <pic:nvPicPr>
+                    <pic:cNvPr id="0" name="" descr=""/>
+                    <pic:cNvPicPr>
+                      <a:picLocks noChangeAspect="1" noChangeArrowheads="1"/>
+                    </pic:cNvPicPr>
+                  </pic:nvPicPr>
+                  <pic:blipFill>
+                    <a:blip r:embed="rId14" cstate="none"/>
+                    <a:srcRect/>
+                    <a:stretch>
+                      <a:fillRect/>
+                    </a:stretch>
+                  </pic:blipFill>
+                  <pic:spPr bwMode="auto">
+                    <a:xfrm>
+                      <a:off x="0" y="0"/>
                       <a:ext cx="5905500" cy="3667125"/>
                     </a:xfrm>
                     <a:prstGeom prst="rect">
@@ -1414,6 +1552,52 @@
     </w:p>
     <w:p>
       <w:pPr>
+        <w:spacing w:after="160" w:before="120"/>
+        <w:jc w:val="center"/>
+      </w:pPr>
+      <w:r>
+        <w:drawing>
+          <wp:inline distT="0" distB="0" distL="0" distR="0">
+            <wp:extent cx="3810000" cy="2857500"/>
+            <wp:effectExtent t="0" r="0" b="0" l="0"/>
+            <wp:docPr id="1" name="" descr="" title=""/>
+            <wp:cNvGraphicFramePr>
+              <a:graphicFrameLocks xmlns:a="http://schemas.openxmlformats.org/drawingml/2006/main" noChangeAspect="1"/>
+            </wp:cNvGraphicFramePr>
+            <a:graphic xmlns:a="http://schemas.openxmlformats.org/drawingml/2006/main">
+              <a:graphicData uri="http://schemas.openxmlformats.org/drawingml/2006/picture">
+                <pic:pic xmlns:pic="http://schemas.openxmlformats.org/drawingml/2006/picture">
+                  <pic:nvPicPr>
+                    <pic:cNvPr id="0" name="" descr=""/>
+                    <pic:cNvPicPr>
+                      <a:picLocks noChangeAspect="1" noChangeArrowheads="1"/>
+                    </pic:cNvPicPr>
+                  </pic:nvPicPr>
+                  <pic:blipFill>
+                    <a:blip r:embed="rId15" cstate="none"/>
+                    <a:srcRect/>
+                    <a:stretch>
+                      <a:fillRect/>
+                    </a:stretch>
+                  </pic:blipFill>
+                  <pic:spPr bwMode="auto">
+                    <a:xfrm>
+                      <a:off x="0" y="0"/>
+                      <a:ext cx="3810000" cy="2857500"/>
+                    </a:xfrm>
+                    <a:prstGeom prst="rect">
+                      <a:avLst/>
+                    </a:prstGeom>
+                  </pic:spPr>
+                </pic:pic>
+              </a:graphicData>
+            </a:graphic>
+          </wp:inline>
+        </w:drawing>
+      </w:r>
+    </w:p>
+    <w:p>
+      <w:pPr>
         <w:pStyle w:val="Heading1"/>
         <w:pBdr>
           <w:bottom w:val="single" w:color="1F4E79" w:sz="6" w:space="4"/>
@@ -1602,6 +1786,52 @@
     </w:p>
     <w:p>
       <w:pPr>
+        <w:spacing w:after="160" w:before="120"/>
+        <w:jc w:val="center"/>
+      </w:pPr>
+      <w:r>
+        <w:drawing>
+          <wp:inline distT="0" distB="0" distL="0" distR="0">
+            <wp:extent cx="3810000" cy="2543175"/>
+            <wp:effectExtent t="0" r="0" b="0" l="0"/>
+            <wp:docPr id="1" name="" descr="" title=""/>
+            <wp:cNvGraphicFramePr>
+              <a:graphicFrameLocks xmlns:a="http://schemas.openxmlformats.org/drawingml/2006/main" noChangeAspect="1"/>
+            </wp:cNvGraphicFramePr>
+            <a:graphic xmlns:a="http://schemas.openxmlformats.org/drawingml/2006/main">
+              <a:graphicData uri="http://schemas.openxmlformats.org/drawingml/2006/picture">
+                <pic:pic xmlns:pic="http://schemas.openxmlformats.org/drawingml/2006/picture">
+                  <pic:nvPicPr>
+                    <pic:cNvPr id="0" name="" descr=""/>
+                    <pic:cNvPicPr>
+                      <a:picLocks noChangeAspect="1" noChangeArrowheads="1"/>
+                    </pic:cNvPicPr>
+                  </pic:nvPicPr>
+                  <pic:blipFill>
+                    <a:blip r:embed="rId16" cstate="none"/>
+                    <a:srcRect/>
+                    <a:stretch>
+                      <a:fillRect/>
+                    </a:stretch>
+                  </pic:blipFill>
+                  <pic:spPr bwMode="auto">
+                    <a:xfrm>
+                      <a:off x="0" y="0"/>
+                      <a:ext cx="3810000" cy="2543175"/>
+                    </a:xfrm>
+                    <a:prstGeom prst="rect">
+                      <a:avLst/>
+                    </a:prstGeom>
+                  </pic:spPr>
+                </pic:pic>
+              </a:graphicData>
+            </a:graphic>
+          </wp:inline>
+        </w:drawing>
+      </w:r>
+    </w:p>
+    <w:p>
+      <w:pPr>
         <w:pStyle w:val="Heading1"/>
         <w:pBdr>
           <w:bottom w:val="single" w:color="1F4E79" w:sz="6" w:space="4"/>
@@ -1664,6 +1894,52 @@
           <w:szCs w:val="22"/>
         </w:rPr>
         <w:t xml:space="preserve">En cuanto a computadoras de a bordo, la inteligencia ucraniana informó en junio de 2025 de una serie "MS" de Shahed con una minicomputadora Nvidia Jetson Orin para procesar vídeo, cámara infrarroja y un módem de radio para vídeo y telemetría [10]. En 2026 se reportó que el modelo a reacción Geran-4 llevaba una Raspberry Pi encargada de la visión artificial y un módem de radio en malla con otros drones, sin Starlink [11]. Ya en septiembre de 2024 se había derribado un Geran-2 con terminal Starlink [20], y en 2025–2026 la instalación de estos terminales se masificó en drones de alcance medio [21].</w:t>
+      </w:r>
+    </w:p>
+    <w:p>
+      <w:pPr>
+        <w:spacing w:after="160" w:before="120"/>
+        <w:jc w:val="center"/>
+      </w:pPr>
+      <w:r>
+        <w:drawing>
+          <wp:inline distT="0" distB="0" distL="0" distR="0">
+            <wp:extent cx="5905500" cy="2600325"/>
+            <wp:effectExtent t="0" r="0" b="0" l="0"/>
+            <wp:docPr id="1" name="" descr="" title=""/>
+            <wp:cNvGraphicFramePr>
+              <a:graphicFrameLocks xmlns:a="http://schemas.openxmlformats.org/drawingml/2006/main" noChangeAspect="1"/>
+            </wp:cNvGraphicFramePr>
+            <a:graphic xmlns:a="http://schemas.openxmlformats.org/drawingml/2006/main">
+              <a:graphicData uri="http://schemas.openxmlformats.org/drawingml/2006/picture">
+                <pic:pic xmlns:pic="http://schemas.openxmlformats.org/drawingml/2006/picture">
+                  <pic:nvPicPr>
+                    <pic:cNvPr id="0" name="" descr=""/>
+                    <pic:cNvPicPr>
+                      <a:picLocks noChangeAspect="1" noChangeArrowheads="1"/>
+                    </pic:cNvPicPr>
+                  </pic:nvPicPr>
+                  <pic:blipFill>
+                    <a:blip r:embed="rId17" cstate="none"/>
+                    <a:srcRect/>
+                    <a:stretch>
+                      <a:fillRect/>
+                    </a:stretch>
+                  </pic:blipFill>
+                  <pic:spPr bwMode="auto">
+                    <a:xfrm>
+                      <a:off x="0" y="0"/>
+                      <a:ext cx="5905500" cy="2600325"/>
+                    </a:xfrm>
+                    <a:prstGeom prst="rect">
+                      <a:avLst/>
+                    </a:prstGeom>
+                  </pic:spPr>
+                </pic:pic>
+              </a:graphicData>
+            </a:graphic>
+          </wp:inline>
+        </w:drawing>
       </w:r>
     </w:p>
     <w:p>
@@ -2802,6 +3078,52 @@
     </w:p>
     <w:p>
       <w:pPr>
+        <w:spacing w:after="160" w:before="120"/>
+        <w:jc w:val="center"/>
+      </w:pPr>
+      <w:r>
+        <w:drawing>
+          <wp:inline distT="0" distB="0" distL="0" distR="0">
+            <wp:extent cx="3429000" cy="1685925"/>
+            <wp:effectExtent t="0" r="0" b="0" l="0"/>
+            <wp:docPr id="1" name="" descr="" title=""/>
+            <wp:cNvGraphicFramePr>
+              <a:graphicFrameLocks xmlns:a="http://schemas.openxmlformats.org/drawingml/2006/main" noChangeAspect="1"/>
+            </wp:cNvGraphicFramePr>
+            <a:graphic xmlns:a="http://schemas.openxmlformats.org/drawingml/2006/main">
+              <a:graphicData uri="http://schemas.openxmlformats.org/drawingml/2006/picture">
+                <pic:pic xmlns:pic="http://schemas.openxmlformats.org/drawingml/2006/picture">
+                  <pic:nvPicPr>
+                    <pic:cNvPr id="0" name="" descr=""/>
+                    <pic:cNvPicPr>
+                      <a:picLocks noChangeAspect="1" noChangeArrowheads="1"/>
+                    </pic:cNvPicPr>
+                  </pic:nvPicPr>
+                  <pic:blipFill>
+                    <a:blip r:embed="rId18" cstate="none"/>
+                    <a:srcRect/>
+                    <a:stretch>
+                      <a:fillRect/>
+                    </a:stretch>
+                  </pic:blipFill>
+                  <pic:spPr bwMode="auto">
+                    <a:xfrm>
+                      <a:off x="0" y="0"/>
+                      <a:ext cx="3429000" cy="1685925"/>
+                    </a:xfrm>
+                    <a:prstGeom prst="rect">
+                      <a:avLst/>
+                    </a:prstGeom>
+                  </pic:spPr>
+                </pic:pic>
+              </a:graphicData>
+            </a:graphic>
+          </wp:inline>
+        </w:drawing>
+      </w:r>
+    </w:p>
+    <w:p>
+      <w:pPr>
         <w:pStyle w:val="Heading1"/>
         <w:pBdr>
           <w:bottom w:val="single" w:color="1F4E79" w:sz="6" w:space="4"/>
@@ -3650,6 +3972,52 @@
           <w:szCs w:val="22"/>
         </w:rPr>
         <w:t xml:space="preserve">, un motor de software que coordina como un solo enjambre drones de distintos fabricantes que ejecutan AuterionOS y Skynode S [13, 12]. En julio de 2026 anunció con la empresa ucraniana SkyFall el envío de 50 000 drones Shrike equipados con su pila de autonomía Skynode S, financiado por un país europeo de la OTAN [24].</w:t>
+      </w:r>
+    </w:p>
+    <w:p>
+      <w:pPr>
+        <w:spacing w:after="160" w:before="120"/>
+        <w:jc w:val="center"/>
+      </w:pPr>
+      <w:r>
+        <w:drawing>
+          <wp:inline distT="0" distB="0" distL="0" distR="0">
+            <wp:extent cx="3619500" cy="2447925"/>
+            <wp:effectExtent t="0" r="0" b="0" l="0"/>
+            <wp:docPr id="1" name="" descr="" title=""/>
+            <wp:cNvGraphicFramePr>
+              <a:graphicFrameLocks xmlns:a="http://schemas.openxmlformats.org/drawingml/2006/main" noChangeAspect="1"/>
+            </wp:cNvGraphicFramePr>
+            <a:graphic xmlns:a="http://schemas.openxmlformats.org/drawingml/2006/main">
+              <a:graphicData uri="http://schemas.openxmlformats.org/drawingml/2006/picture">
+                <pic:pic xmlns:pic="http://schemas.openxmlformats.org/drawingml/2006/picture">
+                  <pic:nvPicPr>
+                    <pic:cNvPr id="0" name="" descr=""/>
+                    <pic:cNvPicPr>
+                      <a:picLocks noChangeAspect="1" noChangeArrowheads="1"/>
+                    </pic:cNvPicPr>
+                  </pic:nvPicPr>
+                  <pic:blipFill>
+                    <a:blip r:embed="rId19" cstate="none"/>
+                    <a:srcRect/>
+                    <a:stretch>
+                      <a:fillRect/>
+                    </a:stretch>
+                  </pic:blipFill>
+                  <pic:spPr bwMode="auto">
+                    <a:xfrm>
+                      <a:off x="0" y="0"/>
+                      <a:ext cx="3619500" cy="2447925"/>
+                    </a:xfrm>
+                    <a:prstGeom prst="rect">
+                      <a:avLst/>
+                    </a:prstGeom>
+                  </pic:spPr>
+                </pic:pic>
+              </a:graphicData>
+            </a:graphic>
+          </wp:inline>
+        </w:drawing>
       </w:r>
     </w:p>
     <w:p>
@@ -6372,7 +6740,7 @@
                     </pic:cNvPicPr>
                   </pic:nvPicPr>
                   <pic:blipFill>
-                    <a:blip r:embed="rId12" cstate="none"/>
+                    <a:blip r:embed="rId20" cstate="none"/>
                     <a:srcRect/>
                     <a:stretch>
                       <a:fillRect/>
@@ -7927,6 +8295,52 @@
           <w:szCs w:val="22"/>
         </w:rPr>
         <w:t xml:space="preserve">Para el UAV propuesto hay un detalle práctico importante: los módulos MQ suelen alimentarse a 5 V y su salida analógica puede llegar a 5 V, mientras que el ADC del RPi Pico (12 bits) admite como máximo 3,3 V. Es obligatorio un divisor de tensión o un conversor externo; de lo contrario se daña la entrada del microcontrolador.</w:t>
+      </w:r>
+    </w:p>
+    <w:p>
+      <w:pPr>
+        <w:spacing w:after="160" w:before="120"/>
+        <w:jc w:val="center"/>
+      </w:pPr>
+      <w:r>
+        <w:drawing>
+          <wp:inline distT="0" distB="0" distL="0" distR="0">
+            <wp:extent cx="3143250" cy="4029075"/>
+            <wp:effectExtent t="0" r="0" b="0" l="0"/>
+            <wp:docPr id="1" name="" descr="" title=""/>
+            <wp:cNvGraphicFramePr>
+              <a:graphicFrameLocks xmlns:a="http://schemas.openxmlformats.org/drawingml/2006/main" noChangeAspect="1"/>
+            </wp:cNvGraphicFramePr>
+            <a:graphic xmlns:a="http://schemas.openxmlformats.org/drawingml/2006/main">
+              <a:graphicData uri="http://schemas.openxmlformats.org/drawingml/2006/picture">
+                <pic:pic xmlns:pic="http://schemas.openxmlformats.org/drawingml/2006/picture">
+                  <pic:nvPicPr>
+                    <pic:cNvPr id="0" name="" descr=""/>
+                    <pic:cNvPicPr>
+                      <a:picLocks noChangeAspect="1" noChangeArrowheads="1"/>
+                    </pic:cNvPicPr>
+                  </pic:nvPicPr>
+                  <pic:blipFill>
+                    <a:blip r:embed="rId21" cstate="none"/>
+                    <a:srcRect/>
+                    <a:stretch>
+                      <a:fillRect/>
+                    </a:stretch>
+                  </pic:blipFill>
+                  <pic:spPr bwMode="auto">
+                    <a:xfrm>
+                      <a:off x="0" y="0"/>
+                      <a:ext cx="3143250" cy="4029075"/>
+                    </a:xfrm>
+                    <a:prstGeom prst="rect">
+                      <a:avLst/>
+                    </a:prstGeom>
+                  </pic:spPr>
+                </pic:pic>
+              </a:graphicData>
+            </a:graphic>
+          </wp:inline>
+        </w:drawing>
       </w:r>
     </w:p>
     <w:p>
@@ -11005,7 +11419,7 @@
                     </pic:cNvPicPr>
                   </pic:nvPicPr>
                   <pic:blipFill>
-                    <a:blip r:embed="rId13" cstate="none"/>
+                    <a:blip r:embed="rId22" cstate="none"/>
                     <a:srcRect/>
                     <a:stretch>
                       <a:fillRect/>
@@ -12014,7 +12428,7 @@
                     </pic:cNvPicPr>
                   </pic:nvPicPr>
                   <pic:blipFill>
-                    <a:blip r:embed="rId14" cstate="none"/>
+                    <a:blip r:embed="rId23" cstate="none"/>
                     <a:srcRect/>
                     <a:stretch>
                       <a:fillRect/>
@@ -12826,7 +13240,7 @@
                     </pic:cNvPicPr>
                   </pic:nvPicPr>
                   <pic:blipFill>
-                    <a:blip r:embed="rId15" cstate="none"/>
+                    <a:blip r:embed="rId24" cstate="none"/>
                     <a:srcRect/>
                     <a:stretch>
                       <a:fillRect/>
@@ -12957,7 +13371,7 @@
                     </pic:cNvPicPr>
                   </pic:nvPicPr>
                   <pic:blipFill>
-                    <a:blip r:embed="rId16" cstate="none"/>
+                    <a:blip r:embed="rId25" cstate="none"/>
                     <a:srcRect/>
                     <a:stretch>
                       <a:fillRect/>

</xml_diff>